<commit_message>
v1.0.17 release — mouse-copy prefix-m toggle (A42) + bash-login double-prompt guard (A41) + B3 escape closure (47 caught/0 escaped). Dual-host validated: Mistborn setup GREEN suite 51/0/4 meta 47/0; nezha setup GREEN 43/0/12, double-prompt re-proven real-HOME bash -l -i 2->1. CodeGraph 0.9.7 validate PASS both hosts. VERSION 1.0.17/18 released 2026-05-29 + CHANGELOG + docs/changelogs/v1.0.17.md. Sources verified 2026-05-29: https://man.openbsd.org/tmux.1 (mouse toggle + S-/M- modifiers).
Signed-off-by: Milos Vasic <i@mvasic.ru>
</commit_message>
<xml_diff>
--- a/docs/guides/clipboard.docx
+++ b/docs/guides/clipboard.docx
@@ -10,7 +10,7 @@
         <w:t xml:space="preserve">clipboard</w:t>
       </w:r>
     </w:p>
-    <w:bookmarkStart w:id="26" w:name="tmx-clipboard--operator-guide"/>
+    <w:bookmarkStart w:id="28" w:name="tmx-clipboard--operator-guide"/>
     <w:p>
       <w:pPr>
         <w:pStyle w:val="Heading1"/>
@@ -34,7 +34,7 @@
         <w:t xml:space="preserve"> </w:t>
       </w:r>
       <w:r>
-        <w:t xml:space="preserve">1</w:t>
+        <w:t xml:space="preserve">2</w:t>
       </w:r>
       <w:r>
         <w:t xml:space="preserve"> </w:t>
@@ -50,7 +50,7 @@
         <w:t xml:space="preserve"> </w:t>
       </w:r>
       <w:r>
-        <w:t xml:space="preserve">2026-05-28T17:00:00Z</w:t>
+        <w:t xml:space="preserve">2026-05-29T11:40:00Z</w:t>
       </w:r>
       <w:r>
         <w:t xml:space="preserve"> </w:t>
@@ -98,7 +98,22 @@
         <w:t xml:space="preserve"> </w:t>
       </w:r>
       <w:r>
-        <w:t xml:space="preserve">Operator-facing guide for the v1.0.14 / v1.0.15 clipboard surface — multi-line copy-OUT, paste-IN, and modifier-drag selection inside mouse-tracking TUIs (especially Claude Code, vim, less, htop).</w:t>
+        <w:t xml:space="preserve">Operator-facing guide for the v1.0.14 / v1.0.15 / v1.0.17 clipboard surface — multi-line copy-OUT, paste-IN, modifier-drag selection, and the</w:t>
+      </w:r>
+      <w:r>
+        <w:t xml:space="preserve"> </w:t>
+      </w:r>
+      <w:r>
+        <w:rPr>
+          <w:rStyle w:val="VerbatimChar"/>
+        </w:rPr>
+        <w:t xml:space="preserve">prefix m</w:t>
+      </w:r>
+      <w:r>
+        <w:t xml:space="preserve"> </w:t>
+      </w:r>
+      <w:r>
+        <w:t xml:space="preserve">mouse-toggle escape hatch inside mouse-tracking TUIs (especially Claude Code, vim, less, htop).</w:t>
       </w:r>
     </w:p>
     <w:p>
@@ -240,29 +255,82 @@
                 <w:b/>
                 <w:bCs/>
               </w:rPr>
-              <w:t xml:space="preserve">Alt-drag</w:t>
+              <w:t xml:space="preserve">Shift-drag</w:t>
             </w:r>
             <w:r>
               <w:t xml:space="preserve"> </w:t>
             </w:r>
             <w:r>
-              <w:t xml:space="preserve">(macOS) OR</w:t>
-            </w:r>
-            <w:r>
-              <w:t xml:space="preserve"> </w:t>
-            </w:r>
+              <w:t xml:space="preserve">(works on every terminal) — then paste as above</w:t>
+            </w:r>
+          </w:p>
+        </w:tc>
+      </w:tr>
+      <w:tr>
+        <w:tc>
+          <w:tcPr/>
+          <w:p>
+            <w:pPr>
+              <w:pStyle w:val="Compact"/>
+            </w:pPr>
             <w:r>
               <w:rPr>
                 <w:b/>
                 <w:bCs/>
               </w:rPr>
-              <w:t xml:space="preserve">Shift-drag</w:t>
+              <w:t xml:space="preserve">Just let me select with the mouse like a normal terminal</w:t>
+            </w:r>
+          </w:p>
+        </w:tc>
+        <w:tc>
+          <w:tcPr/>
+          <w:p>
+            <w:pPr>
+              <w:pStyle w:val="Compact"/>
+            </w:pPr>
+            <w:r>
+              <w:rPr>
+                <w:rStyle w:val="VerbatimChar"/>
+                <w:b/>
+                <w:bCs/>
+              </w:rPr>
+              <w:t xml:space="preserve">prefix + m</w:t>
             </w:r>
             <w:r>
               <w:t xml:space="preserve"> </w:t>
             </w:r>
             <w:r>
-              <w:t xml:space="preserve">(Linux) — then paste as above</w:t>
+              <w:t xml:space="preserve">to toggle tmux mouse OFF, then drag normally and</w:t>
+            </w:r>
+            <w:r>
+              <w:t xml:space="preserve"> </w:t>
+            </w:r>
+            <w:r>
+              <w:rPr>
+                <w:rStyle w:val="VerbatimChar"/>
+              </w:rPr>
+              <w:t xml:space="preserve">Cmd-C</w:t>
+            </w:r>
+            <w:r>
+              <w:t xml:space="preserve"> </w:t>
+            </w:r>
+            <w:r>
+              <w:t xml:space="preserve">/ right-click → Copy;</w:t>
+            </w:r>
+            <w:r>
+              <w:t xml:space="preserve"> </w:t>
+            </w:r>
+            <w:r>
+              <w:rPr>
+                <w:rStyle w:val="VerbatimChar"/>
+              </w:rPr>
+              <w:t xml:space="preserve">prefix + m</w:t>
+            </w:r>
+            <w:r>
+              <w:t xml:space="preserve"> </w:t>
+            </w:r>
+            <w:r>
+              <w:t xml:space="preserve">again to restore tmux scrollback</w:t>
             </w:r>
           </w:p>
         </w:tc>
@@ -482,7 +550,7 @@
       </w:r>
     </w:p>
     <w:bookmarkEnd w:id="9"/>
-    <w:bookmarkStart w:id="12" w:name="X41840fad9d6ccfc526049e939a0ec2ce022a724"/>
+    <w:bookmarkStart w:id="13" w:name="X41840fad9d6ccfc526049e939a0ec2ce022a724"/>
     <w:p>
       <w:pPr>
         <w:pStyle w:val="Heading2"/>
@@ -840,52 +908,11 @@
               <w:pStyle w:val="Compact"/>
             </w:pPr>
             <w:r>
-              <w:t xml:space="preserve">macOS (Terminal.app, iTerm2, WezTerm, Ghostty, Alacritty)</w:t>
-            </w:r>
-          </w:p>
-        </w:tc>
-        <w:tc>
-          <w:tcPr/>
-          <w:p>
-            <w:pPr>
-              <w:pStyle w:val="Compact"/>
-            </w:pPr>
-            <w:r>
               <w:rPr>
                 <w:b/>
                 <w:bCs/>
               </w:rPr>
-              <w:t xml:space="preserve">Alt-drag</w:t>
-            </w:r>
-            <w:r>
-              <w:t xml:space="preserve"> </w:t>
-            </w:r>
-            <w:r>
-              <w:t xml:space="preserve">(hold Option)</w:t>
-            </w:r>
-          </w:p>
-        </w:tc>
-        <w:tc>
-          <w:tcPr/>
-          <w:p>
-            <w:pPr>
-              <w:pStyle w:val="Compact"/>
-            </w:pPr>
-            <w:r>
-              <w:t xml:space="preserve">Option passes through cleanly on every macOS terminal we tested</w:t>
-            </w:r>
-          </w:p>
-        </w:tc>
-      </w:tr>
-      <w:tr>
-        <w:tc>
-          <w:tcPr/>
-          <w:p>
-            <w:pPr>
-              <w:pStyle w:val="Compact"/>
-            </w:pPr>
-            <w:r>
-              <w:t xml:space="preserve">Linux (gnome-terminal, konsole, xterm, kitty, foot, alacritty)</w:t>
+              <w:t xml:space="preserve">Any OS / any terminal</w:t>
             </w:r>
           </w:p>
         </w:tc>
@@ -911,7 +938,19 @@
               <w:pStyle w:val="Compact"/>
             </w:pPr>
             <w:r>
-              <w:t xml:space="preserve">The natural "select even in mouse-tracking apps" modifier on X11/Wayland; also the modifier most terminals already use to bypass their own mouse handling</w:t>
+              <w:t xml:space="preserve">The most reliable in-tmux gesture: no mainstream terminal claims Shift as a bypass modifier, so Shift-mouse events are forwarded to tmux, which forces copy-mode via</w:t>
+            </w:r>
+            <w:r>
+              <w:t xml:space="preserve"> </w:t>
+            </w:r>
+            <w:r>
+              <w:rPr>
+                <w:rStyle w:val="VerbatimChar"/>
+              </w:rPr>
+              <w:t xml:space="preserve">S-MouseDrag1Pane</w:t>
+            </w:r>
+            <w:r>
+              <w:t xml:space="preserve">. Works on macOS AND Linux.</w:t>
             </w:r>
           </w:p>
         </w:tc>
@@ -924,6 +963,85 @@
               <w:pStyle w:val="Compact"/>
             </w:pPr>
             <w:r>
+              <w:t xml:space="preserve">macOS (Terminal.app, WezTerm, Ghostty, Alacritty)</w:t>
+            </w:r>
+          </w:p>
+        </w:tc>
+        <w:tc>
+          <w:tcPr/>
+          <w:p>
+            <w:pPr>
+              <w:pStyle w:val="Compact"/>
+            </w:pPr>
+            <w:r>
+              <w:t xml:space="preserve">Alt-drag (hold Option) also works</w:t>
+            </w:r>
+          </w:p>
+        </w:tc>
+        <w:tc>
+          <w:tcPr/>
+          <w:p>
+            <w:pPr>
+              <w:pStyle w:val="Compact"/>
+            </w:pPr>
+            <w:r>
+              <w:t xml:space="preserve">Option passes through to tmux on these terminals →</w:t>
+            </w:r>
+            <w:r>
+              <w:t xml:space="preserve"> </w:t>
+            </w:r>
+            <w:r>
+              <w:rPr>
+                <w:rStyle w:val="VerbatimChar"/>
+              </w:rPr>
+              <w:t xml:space="preserve">M-MouseDrag1Pane</w:t>
+            </w:r>
+          </w:p>
+        </w:tc>
+      </w:tr>
+      <w:tr>
+        <w:tc>
+          <w:tcPr/>
+          <w:p>
+            <w:pPr>
+              <w:pStyle w:val="Compact"/>
+            </w:pPr>
+            <w:r>
+              <w:t xml:space="preserve">Linux (gnome-terminal, konsole, xterm, kitty, foot, alacritty)</w:t>
+            </w:r>
+          </w:p>
+        </w:tc>
+        <w:tc>
+          <w:tcPr/>
+          <w:p>
+            <w:pPr>
+              <w:pStyle w:val="Compact"/>
+            </w:pPr>
+            <w:r>
+              <w:t xml:space="preserve">Alt-drag also works</w:t>
+            </w:r>
+          </w:p>
+        </w:tc>
+        <w:tc>
+          <w:tcPr/>
+          <w:p>
+            <w:pPr>
+              <w:pStyle w:val="Compact"/>
+            </w:pPr>
+            <w:r>
+              <w:t xml:space="preserve">Option/Meta forwarded to tmux on X11/Wayland</w:t>
+            </w:r>
+          </w:p>
+        </w:tc>
+      </w:tr>
+      <w:tr>
+        <w:tc>
+          <w:tcPr/>
+          <w:p>
+            <w:pPr>
+              <w:pStyle w:val="Compact"/>
+            </w:pPr>
+            <w:r>
               <w:t xml:space="preserve">Termux on Android</w:t>
             </w:r>
           </w:p>
@@ -954,10 +1072,264 @@
     </w:tbl>
     <w:p>
       <w:pPr>
-        <w:pStyle w:val="BodyText"/>
-      </w:pPr>
-      <w:r>
-        <w:t xml:space="preserve">Either modifier works on either OS — pick whichever your terminal forwards correctly.</w:t>
+        <w:pStyle w:val="BlockText"/>
+      </w:pPr>
+      <w:r>
+        <w:rPr>
+          <w:b/>
+          <w:bCs/>
+        </w:rPr>
+        <w:t xml:space="preserve">iTerm2 caveat (forensic anchor: user report 2026-05-29).</w:t>
+      </w:r>
+      <w:r>
+        <w:t xml:space="preserve"> </w:t>
+      </w:r>
+      <w:r>
+        <w:t xml:space="preserve">With iTerm2's default</w:t>
+      </w:r>
+      <w:r>
+        <w:t xml:space="preserve"> </w:t>
+      </w:r>
+      <w:r>
+        <w:rPr>
+          <w:i/>
+          <w:iCs/>
+        </w:rPr>
+        <w:t xml:space="preserve">Option Key Sends = Normal</w:t>
+      </w:r>
+      <w:r>
+        <w:t xml:space="preserve">, iTerm2 treats</w:t>
+      </w:r>
+      <w:r>
+        <w:t xml:space="preserve"> </w:t>
+      </w:r>
+      <w:r>
+        <w:rPr>
+          <w:b/>
+          <w:bCs/>
+        </w:rPr>
+        <w:t xml:space="preserve">Option-drag as its OWN native-selection bypass</w:t>
+      </w:r>
+      <w:r>
+        <w:t xml:space="preserve"> </w:t>
+      </w:r>
+      <w:r>
+        <w:t xml:space="preserve">— the drag never reaches tmux, so</w:t>
+      </w:r>
+      <w:r>
+        <w:t xml:space="preserve"> </w:t>
+      </w:r>
+      <w:r>
+        <w:rPr>
+          <w:rStyle w:val="VerbatimChar"/>
+        </w:rPr>
+        <w:t xml:space="preserve">M-MouseDrag1Pane</w:t>
+      </w:r>
+      <w:r>
+        <w:t xml:space="preserve"> </w:t>
+      </w:r>
+      <w:r>
+        <w:t xml:space="preserve">does NOT fire. That native iTerm2 selection still works (copy it with</w:t>
+      </w:r>
+      <w:r>
+        <w:t xml:space="preserve"> </w:t>
+      </w:r>
+      <w:r>
+        <w:rPr>
+          <w:rStyle w:val="VerbatimChar"/>
+        </w:rPr>
+        <w:t xml:space="preserve">Cmd-C</w:t>
+      </w:r>
+      <w:r>
+        <w:t xml:space="preserve">), but if you want tmux's copy-mode selection,</w:t>
+      </w:r>
+      <w:r>
+        <w:t xml:space="preserve"> </w:t>
+      </w:r>
+      <w:r>
+        <w:rPr>
+          <w:b/>
+          <w:bCs/>
+        </w:rPr>
+        <w:t xml:space="preserve">use Shift-drag</w:t>
+      </w:r>
+      <w:r>
+        <w:t xml:space="preserve"> </w:t>
+      </w:r>
+      <w:r>
+        <w:t xml:space="preserve">(or the</w:t>
+      </w:r>
+      <w:r>
+        <w:t xml:space="preserve"> </w:t>
+      </w:r>
+      <w:r>
+        <w:rPr>
+          <w:rStyle w:val="VerbatimChar"/>
+        </w:rPr>
+        <w:t xml:space="preserve">prefix m</w:t>
+      </w:r>
+      <w:r>
+        <w:t xml:space="preserve"> </w:t>
+      </w:r>
+      <w:r>
+        <w:t xml:space="preserve">toggle below). This is why Shift is the recommended cross-terminal gesture.</w:t>
+      </w:r>
+    </w:p>
+    <w:bookmarkEnd w:id="11"/>
+    <w:bookmarkStart w:id="12" w:name="X77efddea3e9221c9eb686c9cccf2c345d3ca81b"/>
+    <w:p>
+      <w:pPr>
+        <w:pStyle w:val="Heading3"/>
+      </w:pPr>
+      <w:r>
+        <w:t xml:space="preserve">The simplest, always-works escape:</w:t>
+      </w:r>
+      <w:r>
+        <w:t xml:space="preserve"> </w:t>
+      </w:r>
+      <w:r>
+        <w:rPr>
+          <w:rStyle w:val="VerbatimChar"/>
+        </w:rPr>
+        <w:t xml:space="preserve">prefix + m</w:t>
+      </w:r>
+      <w:r>
+        <w:t xml:space="preserve"> </w:t>
+      </w:r>
+      <w:r>
+        <w:t xml:space="preserve">(v1.0.17)</w:t>
+      </w:r>
+    </w:p>
+    <w:p>
+      <w:pPr>
+        <w:pStyle w:val="FirstParagraph"/>
+      </w:pPr>
+      <w:r>
+        <w:t xml:space="preserve">If you just want to</w:t>
+      </w:r>
+      <w:r>
+        <w:t xml:space="preserve"> </w:t>
+      </w:r>
+      <w:r>
+        <w:rPr>
+          <w:b/>
+          <w:bCs/>
+        </w:rPr>
+        <w:t xml:space="preserve">select and copy with the mouse like a normal terminal</w:t>
+      </w:r>
+      <w:r>
+        <w:t xml:space="preserve"> </w:t>
+      </w:r>
+      <w:r>
+        <w:t xml:space="preserve">— no modifier gymnastics, works identically in Claude Code, vim, plain shell, every terminal:</w:t>
+      </w:r>
+    </w:p>
+    <w:p>
+      <w:pPr>
+        <w:pStyle w:val="SourceCode"/>
+      </w:pPr>
+      <w:r>
+        <w:rPr>
+          <w:rStyle w:val="VerbatimChar"/>
+        </w:rPr>
+        <w:t xml:space="preserve">bind m set -g mouse \; display-message 'mouse #{?mouse,ON …,OFF (use native terminal selection: drag + Cmd-C)}'</w:t>
+      </w:r>
+    </w:p>
+    <w:p>
+      <w:pPr>
+        <w:pStyle w:val="FirstParagraph"/>
+      </w:pPr>
+      <w:r>
+        <w:t xml:space="preserve">Press</w:t>
+      </w:r>
+      <w:r>
+        <w:t xml:space="preserve"> </w:t>
+      </w:r>
+      <w:r>
+        <w:rPr>
+          <w:rStyle w:val="VerbatimChar"/>
+          <w:b/>
+          <w:bCs/>
+        </w:rPr>
+        <w:t xml:space="preserve">prefix m</w:t>
+      </w:r>
+      <w:r>
+        <w:t xml:space="preserve"> </w:t>
+      </w:r>
+      <w:r>
+        <w:t xml:space="preserve">to toggle tmux's mouse handling</w:t>
+      </w:r>
+      <w:r>
+        <w:t xml:space="preserve"> </w:t>
+      </w:r>
+      <w:r>
+        <w:rPr>
+          <w:b/>
+          <w:bCs/>
+        </w:rPr>
+        <w:t xml:space="preserve">OFF</w:t>
+      </w:r>
+      <w:r>
+        <w:t xml:space="preserve">. With mouse off, tmux stops capturing drags entirely, so the</w:t>
+      </w:r>
+      <w:r>
+        <w:t xml:space="preserve"> </w:t>
+      </w:r>
+      <w:r>
+        <w:rPr>
+          <w:b/>
+          <w:bCs/>
+        </w:rPr>
+        <w:t xml:space="preserve">outer terminal's own selection</w:t>
+      </w:r>
+      <w:r>
+        <w:t xml:space="preserve"> </w:t>
+      </w:r>
+      <w:r>
+        <w:t xml:space="preserve">(iTerm2 / Terminal.app / WezTerm / any Linux terminal: click-drag →</w:t>
+      </w:r>
+      <w:r>
+        <w:t xml:space="preserve"> </w:t>
+      </w:r>
+      <w:r>
+        <w:rPr>
+          <w:rStyle w:val="VerbatimChar"/>
+        </w:rPr>
+        <w:t xml:space="preserve">Cmd-C</w:t>
+      </w:r>
+      <w:r>
+        <w:t xml:space="preserve"> </w:t>
+      </w:r>
+      <w:r>
+        <w:t xml:space="preserve">or right-click → Copy) works</w:t>
+      </w:r>
+      <w:r>
+        <w:t xml:space="preserve"> </w:t>
+      </w:r>
+      <w:r>
+        <w:rPr>
+          <w:b/>
+          <w:bCs/>
+        </w:rPr>
+        <w:t xml:space="preserve">everywhere, including inside Claude Code</w:t>
+      </w:r>
+      <w:r>
+        <w:t xml:space="preserve">. Press</w:t>
+      </w:r>
+      <w:r>
+        <w:t xml:space="preserve"> </w:t>
+      </w:r>
+      <w:r>
+        <w:rPr>
+          <w:rStyle w:val="VerbatimChar"/>
+        </w:rPr>
+        <w:t xml:space="preserve">prefix m</w:t>
+      </w:r>
+      <w:r>
+        <w:t xml:space="preserve"> </w:t>
+      </w:r>
+      <w:r>
+        <w:t xml:space="preserve">again to turn mouse back ON and restore tmux scrollback + copy-mode. The status line shows the new state each time. (tmux toggles a flag option when its value is omitted — see Sources verified.)</w:t>
       </w:r>
     </w:p>
     <w:p>
@@ -967,9 +1339,9 @@
         </w:pict>
       </w:r>
     </w:p>
-    <w:bookmarkEnd w:id="11"/>
     <w:bookmarkEnd w:id="12"/>
-    <w:bookmarkStart w:id="13" w:name="X33fbadc69da846a473a05609e47150824c74a92"/>
+    <w:bookmarkEnd w:id="13"/>
+    <w:bookmarkStart w:id="14" w:name="X33fbadc69da846a473a05609e47150824c74a92"/>
     <w:p>
       <w:pPr>
         <w:pStyle w:val="Heading2"/>
@@ -1204,8 +1576,8 @@
         </w:pict>
       </w:r>
     </w:p>
-    <w:bookmarkEnd w:id="13"/>
-    <w:bookmarkStart w:id="14" w:name="X2e4d3f66c4f45f88db386d646d3243e379e26bc"/>
+    <w:bookmarkEnd w:id="14"/>
+    <w:bookmarkStart w:id="15" w:name="X2e4d3f66c4f45f88db386d646d3243e379e26bc"/>
     <w:p>
       <w:pPr>
         <w:pStyle w:val="Heading2"/>
@@ -1459,8 +1831,8 @@
         </w:pict>
       </w:r>
     </w:p>
-    <w:bookmarkEnd w:id="14"/>
-    <w:bookmarkStart w:id="15" w:name="Xeede24950de9a215ed3a61688a6b022e9f5252e"/>
+    <w:bookmarkEnd w:id="15"/>
+    <w:bookmarkStart w:id="16" w:name="Xeede24950de9a215ed3a61688a6b022e9f5252e"/>
     <w:p>
       <w:pPr>
         <w:pStyle w:val="Heading2"/>
@@ -1923,8 +2295,8 @@
         </w:pict>
       </w:r>
     </w:p>
-    <w:bookmarkEnd w:id="15"/>
-    <w:bookmarkStart w:id="16" w:name="X0f82250e26c8b58406dd91cb5ad8bd54e9d2d72"/>
+    <w:bookmarkEnd w:id="16"/>
+    <w:bookmarkStart w:id="17" w:name="X0f82250e26c8b58406dd91cb5ad8bd54e9d2d72"/>
     <w:p>
       <w:pPr>
         <w:pStyle w:val="Heading2"/>
@@ -2333,8 +2705,8 @@
         </w:pict>
       </w:r>
     </w:p>
-    <w:bookmarkEnd w:id="16"/>
-    <w:bookmarkStart w:id="17" w:name="Xdc70d271efa238bb586a0e311fd9ba882af8c79"/>
+    <w:bookmarkEnd w:id="17"/>
+    <w:bookmarkStart w:id="18" w:name="Xdc70d271efa238bb586a0e311fd9ba882af8c79"/>
     <w:p>
       <w:pPr>
         <w:pStyle w:val="Heading2"/>
@@ -2784,8 +3156,8 @@
         </w:pict>
       </w:r>
     </w:p>
-    <w:bookmarkEnd w:id="17"/>
-    <w:bookmarkStart w:id="22" w:name="X9a0cd872aeea42ccc5de6d222bb92ecb3d8d37e"/>
+    <w:bookmarkEnd w:id="18"/>
+    <w:bookmarkStart w:id="23" w:name="X9a0cd872aeea42ccc5de6d222bb92ecb3d8d37e"/>
     <w:p>
       <w:pPr>
         <w:pStyle w:val="Heading2"/>
@@ -2823,7 +3195,7 @@
           <w:numId w:val="1002"/>
         </w:numPr>
       </w:pPr>
-      <w:hyperlink r:id="rId18">
+      <w:hyperlink r:id="rId19">
         <w:r>
           <w:rPr>
             <w:rStyle w:val="VerbatimChar"/>
@@ -2846,7 +3218,7 @@
           <w:numId w:val="1002"/>
         </w:numPr>
       </w:pPr>
-      <w:hyperlink r:id="rId19">
+      <w:hyperlink r:id="rId20">
         <w:r>
           <w:rPr>
             <w:rStyle w:val="VerbatimChar"/>
@@ -2869,7 +3241,7 @@
           <w:numId w:val="1002"/>
         </w:numPr>
       </w:pPr>
-      <w:hyperlink r:id="rId20">
+      <w:hyperlink r:id="rId21">
         <w:r>
           <w:rPr>
             <w:rStyle w:val="VerbatimChar"/>
@@ -2892,7 +3264,7 @@
           <w:numId w:val="1002"/>
         </w:numPr>
       </w:pPr>
-      <w:hyperlink r:id="rId21">
+      <w:hyperlink r:id="rId22">
         <w:r>
           <w:rPr>
             <w:rStyle w:val="VerbatimChar"/>
@@ -2914,14 +3286,14 @@
         </w:pict>
       </w:r>
     </w:p>
-    <w:bookmarkEnd w:id="22"/>
-    <w:bookmarkStart w:id="25" w:name="sources-verified-2026-05-28"/>
+    <w:bookmarkEnd w:id="23"/>
+    <w:bookmarkStart w:id="25" w:name="sources-verified-2026-05-29"/>
     <w:p>
       <w:pPr>
         <w:pStyle w:val="Heading2"/>
       </w:pPr>
       <w:r>
-        <w:t xml:space="preserve">Sources verified 2026-05-28</w:t>
+        <w:t xml:space="preserve">Sources verified 2026-05-29</w:t>
       </w:r>
     </w:p>
     <w:p>
@@ -2937,7 +3309,7 @@
           <w:b/>
           <w:bCs/>
         </w:rPr>
-        <w:t xml:space="preserve">tmux 3.6a man page</w:t>
+        <w:t xml:space="preserve">tmux upstream man page</w:t>
       </w:r>
       <w:r>
         <w:t xml:space="preserve"> </w:t>
@@ -2948,200 +3320,7 @@
       <w:r>
         <w:t xml:space="preserve"> </w:t>
       </w:r>
-      <w:r>
-        <w:rPr>
-          <w:rStyle w:val="VerbatimChar"/>
-        </w:rPr>
-        <w:t xml:space="preserve">man tmux</w:t>
-      </w:r>
-      <w:r>
-        <w:t xml:space="preserve"> </w:t>
-      </w:r>
-      <w:r>
-        <w:t xml:space="preserve">on the host (Mistborn Darwin arm64, tmux 3.6a from</w:t>
-      </w:r>
-      <w:r>
-        <w:t xml:space="preserve"> </w:t>
-      </w:r>
-      <w:r>
-        <w:rPr>
-          <w:rStyle w:val="VerbatimChar"/>
-        </w:rPr>
-        <w:t xml:space="preserve">tmux/build-darwin/bin/tmux</w:t>
-      </w:r>
-      <w:r>
-        <w:t xml:space="preserve">). Confirmed:</w:t>
-      </w:r>
-      <w:r>
-        <w:t xml:space="preserve"> </w:t>
-      </w:r>
-      <w:r>
-        <w:rPr>
-          <w:rStyle w:val="VerbatimChar"/>
-        </w:rPr>
-        <w:t xml:space="preserve">S-</w:t>
-      </w:r>
-      <w:r>
-        <w:t xml:space="preserve"> </w:t>
-      </w:r>
-      <w:r>
-        <w:t xml:space="preserve">/</w:t>
-      </w:r>
-      <w:r>
-        <w:t xml:space="preserve"> </w:t>
-      </w:r>
-      <w:r>
-        <w:rPr>
-          <w:rStyle w:val="VerbatimChar"/>
-        </w:rPr>
-        <w:t xml:space="preserve">M-</w:t>
-      </w:r>
-      <w:r>
-        <w:t xml:space="preserve"> </w:t>
-      </w:r>
-      <w:r>
-        <w:t xml:space="preserve">modifier prefixes for keys including mouse events ("Ctrl keys may be prefixed with</w:t>
-      </w:r>
-      <w:r>
-        <w:t xml:space="preserve"> </w:t>
-      </w:r>
-      <w:r>
-        <w:rPr>
-          <w:rStyle w:val="VerbatimChar"/>
-        </w:rPr>
-        <w:t xml:space="preserve">C-</w:t>
-      </w:r>
-      <w:r>
-        <w:t xml:space="preserve"> </w:t>
-      </w:r>
-      <w:r>
-        <w:t xml:space="preserve">or</w:t>
-      </w:r>
-      <w:r>
-        <w:t xml:space="preserve"> </w:t>
-      </w:r>
-      <w:r>
-        <w:rPr>
-          <w:rStyle w:val="VerbatimChar"/>
-        </w:rPr>
-        <w:t xml:space="preserve">^</w:t>
-      </w:r>
-      <w:r>
-        <w:t xml:space="preserve">, Shift keys with</w:t>
-      </w:r>
-      <w:r>
-        <w:t xml:space="preserve"> </w:t>
-      </w:r>
-      <w:r>
-        <w:rPr>
-          <w:rStyle w:val="VerbatimChar"/>
-        </w:rPr>
-        <w:t xml:space="preserve">S-</w:t>
-      </w:r>
-      <w:r>
-        <w:t xml:space="preserve"> </w:t>
-      </w:r>
-      <w:r>
-        <w:t xml:space="preserve">and Alt (meta) with</w:t>
-      </w:r>
-      <w:r>
-        <w:t xml:space="preserve"> </w:t>
-      </w:r>
-      <w:r>
-        <w:rPr>
-          <w:rStyle w:val="VerbatimChar"/>
-        </w:rPr>
-        <w:t xml:space="preserve">M-</w:t>
-      </w:r>
-      <w:r>
-        <w:t xml:space="preserve">");</w:t>
-      </w:r>
-      <w:r>
-        <w:t xml:space="preserve"> </w:t>
-      </w:r>
-      <w:r>
-        <w:rPr>
-          <w:rStyle w:val="VerbatimChar"/>
-        </w:rPr>
-        <w:t xml:space="preserve">MouseDrag1</w:t>
-      </w:r>
-      <w:r>
-        <w:t xml:space="preserve"> </w:t>
-      </w:r>
-      <w:r>
-        <w:t xml:space="preserve">/</w:t>
-      </w:r>
-      <w:r>
-        <w:t xml:space="preserve"> </w:t>
-      </w:r>
-      <w:r>
-        <w:rPr>
-          <w:rStyle w:val="VerbatimChar"/>
-        </w:rPr>
-        <w:t xml:space="preserve">MouseDragEnd1</w:t>
-      </w:r>
-      <w:r>
-        <w:t xml:space="preserve"> </w:t>
-      </w:r>
-      <w:r>
-        <w:t xml:space="preserve">events listed in MOUSE SUPPORT;</w:t>
-      </w:r>
-      <w:r>
-        <w:t xml:space="preserve"> </w:t>
-      </w:r>
-      <w:r>
-        <w:rPr>
-          <w:rStyle w:val="VerbatimChar"/>
-        </w:rPr>
-        <w:t xml:space="preserve">paste-buffer -p</w:t>
-      </w:r>
-      <w:r>
-        <w:t xml:space="preserve"> </w:t>
-      </w:r>
-      <w:r>
-        <w:t xml:space="preserve">documented as "paste bracket control codes are inserted around the buffer if the application has requested bracketed paste mode"; user options prefixed with</w:t>
-      </w:r>
-      <w:r>
-        <w:t xml:space="preserve"> </w:t>
-      </w:r>
-      <w:r>
-        <w:rPr>
-          <w:rStyle w:val="VerbatimChar"/>
-        </w:rPr>
-        <w:t xml:space="preserve">@</w:t>
-      </w:r>
-      <w:r>
-        <w:t xml:space="preserve"> </w:t>
-      </w:r>
-      <w:r>
-        <w:t xml:space="preserve">are arbitrary and string-typed.</w:t>
-      </w:r>
-    </w:p>
-    <w:p>
-      <w:pPr>
-        <w:pStyle w:val="Compact"/>
-        <w:numPr>
-          <w:ilvl w:val="0"/>
-          <w:numId w:val="1003"/>
-        </w:numPr>
-      </w:pPr>
-      <w:r>
-        <w:rPr>
-          <w:b/>
-          <w:bCs/>
-        </w:rPr>
-        <w:t xml:space="preserve">tmux upstream man page mirror</w:t>
-      </w:r>
-      <w:r>
-        <w:t xml:space="preserve"> </w:t>
-      </w:r>
-      <w:r>
-        <w:t xml:space="preserve">—</w:t>
-      </w:r>
-      <w:r>
-        <w:t xml:space="preserve"> </w:t>
-      </w:r>
-      <w:hyperlink r:id="rId23">
+      <w:hyperlink r:id="rId24">
         <w:r>
           <w:rPr>
             <w:rStyle w:val="Hyperlink"/>
@@ -3153,7 +3332,173 @@
         <w:t xml:space="preserve"> </w:t>
       </w:r>
       <w:r>
-        <w:t xml:space="preserve">(verified 2026-05-28; OpenBSD ships the upstream tmux man page).</w:t>
+        <w:t xml:space="preserve">(re-verified 2026-05-29 via WebFetch, OpenBSD ships the upstream tmux man page). Confirmed for the v1.0.17</w:t>
+      </w:r>
+      <w:r>
+        <w:t xml:space="preserve"> </w:t>
+      </w:r>
+      <w:r>
+        <w:rPr>
+          <w:rStyle w:val="VerbatimChar"/>
+        </w:rPr>
+        <w:t xml:space="preserve">prefix m</w:t>
+      </w:r>
+      <w:r>
+        <w:t xml:space="preserve"> </w:t>
+      </w:r>
+      <w:r>
+        <w:t xml:space="preserve">addition: modifier prefixes "Ctrl keys may be prefixed with</w:t>
+      </w:r>
+      <w:r>
+        <w:t xml:space="preserve"> </w:t>
+      </w:r>
+      <w:r>
+        <w:rPr>
+          <w:rStyle w:val="VerbatimChar"/>
+        </w:rPr>
+        <w:t xml:space="preserve">C-</w:t>
+      </w:r>
+      <w:r>
+        <w:t xml:space="preserve"> </w:t>
+      </w:r>
+      <w:r>
+        <w:t xml:space="preserve">or</w:t>
+      </w:r>
+      <w:r>
+        <w:t xml:space="preserve"> </w:t>
+      </w:r>
+      <w:r>
+        <w:rPr>
+          <w:rStyle w:val="VerbatimChar"/>
+        </w:rPr>
+        <w:t xml:space="preserve">^</w:t>
+      </w:r>
+      <w:r>
+        <w:t xml:space="preserve">, Shift keys with</w:t>
+      </w:r>
+      <w:r>
+        <w:t xml:space="preserve"> </w:t>
+      </w:r>
+      <w:r>
+        <w:rPr>
+          <w:rStyle w:val="VerbatimChar"/>
+        </w:rPr>
+        <w:t xml:space="preserve">S-</w:t>
+      </w:r>
+      <w:r>
+        <w:t xml:space="preserve"> </w:t>
+      </w:r>
+      <w:r>
+        <w:t xml:space="preserve">and Alt (meta) with</w:t>
+      </w:r>
+      <w:r>
+        <w:t xml:space="preserve"> </w:t>
+      </w:r>
+      <w:r>
+        <w:rPr>
+          <w:rStyle w:val="VerbatimChar"/>
+        </w:rPr>
+        <w:t xml:space="preserve">M-</w:t>
+      </w:r>
+      <w:r>
+        <w:t xml:space="preserve">" (validates</w:t>
+      </w:r>
+      <w:r>
+        <w:t xml:space="preserve"> </w:t>
+      </w:r>
+      <w:r>
+        <w:rPr>
+          <w:rStyle w:val="VerbatimChar"/>
+        </w:rPr>
+        <w:t xml:space="preserve">S-MouseDrag1Pane</w:t>
+      </w:r>
+      <w:r>
+        <w:t xml:space="preserve"> </w:t>
+      </w:r>
+      <w:r>
+        <w:t xml:space="preserve">/</w:t>
+      </w:r>
+      <w:r>
+        <w:t xml:space="preserve"> </w:t>
+      </w:r>
+      <w:r>
+        <w:rPr>
+          <w:rStyle w:val="VerbatimChar"/>
+        </w:rPr>
+        <w:t xml:space="preserve">M-MouseDrag1Pane</w:t>
+      </w:r>
+      <w:r>
+        <w:t xml:space="preserve">);</w:t>
+      </w:r>
+      <w:r>
+        <w:t xml:space="preserve"> </w:t>
+      </w:r>
+      <w:r>
+        <w:rPr>
+          <w:rStyle w:val="VerbatimChar"/>
+        </w:rPr>
+        <w:t xml:space="preserve">-M</w:t>
+      </w:r>
+      <w:r>
+        <w:t xml:space="preserve"> </w:t>
+      </w:r>
+      <w:r>
+        <w:t xml:space="preserve">"passes through a mouse event (only valid if bound to a mouse key binding, see MOUSE SUPPORT)"; flag/choice options "can be omitted … to toggle its value" (validates</w:t>
+      </w:r>
+      <w:r>
+        <w:t xml:space="preserve"> </w:t>
+      </w:r>
+      <w:r>
+        <w:rPr>
+          <w:rStyle w:val="VerbatimChar"/>
+        </w:rPr>
+        <w:t xml:space="preserve">set -g mouse</w:t>
+      </w:r>
+      <w:r>
+        <w:t xml:space="preserve"> </w:t>
+      </w:r>
+      <w:r>
+        <w:t xml:space="preserve">with no value as a toggle);</w:t>
+      </w:r>
+      <w:r>
+        <w:t xml:space="preserve"> </w:t>
+      </w:r>
+      <w:r>
+        <w:rPr>
+          <w:rStyle w:val="VerbatimChar"/>
+        </w:rPr>
+        <w:t xml:space="preserve">#{?condition,true,false}</w:t>
+      </w:r>
+      <w:r>
+        <w:t xml:space="preserve"> </w:t>
+      </w:r>
+      <w:r>
+        <w:t xml:space="preserve">is the standard FORMATS conditional used in the</w:t>
+      </w:r>
+      <w:r>
+        <w:t xml:space="preserve"> </w:t>
+      </w:r>
+      <w:r>
+        <w:rPr>
+          <w:rStyle w:val="VerbatimChar"/>
+        </w:rPr>
+        <w:t xml:space="preserve">display-message</w:t>
+      </w:r>
+      <w:r>
+        <w:t xml:space="preserve"> </w:t>
+      </w:r>
+      <w:r>
+        <w:t xml:space="preserve">status hint.</w:t>
+      </w:r>
+    </w:p>
+    <w:bookmarkEnd w:id="25"/>
+    <w:bookmarkStart w:id="27" w:name="sources-verified-2026-05-28"/>
+    <w:p>
+      <w:pPr>
+        <w:pStyle w:val="Heading2"/>
+      </w:pPr>
+      <w:r>
+        <w:t xml:space="preserve">Sources verified 2026-05-28</w:t>
       </w:r>
     </w:p>
     <w:p>
@@ -3161,7 +3506,7 @@
         <w:pStyle w:val="Compact"/>
         <w:numPr>
           <w:ilvl w:val="0"/>
-          <w:numId w:val="1003"/>
+          <w:numId w:val="1004"/>
         </w:numPr>
       </w:pPr>
       <w:r>
@@ -3169,6 +3514,238 @@
           <w:b/>
           <w:bCs/>
         </w:rPr>
+        <w:t xml:space="preserve">tmux 3.6a man page</w:t>
+      </w:r>
+      <w:r>
+        <w:t xml:space="preserve"> </w:t>
+      </w:r>
+      <w:r>
+        <w:t xml:space="preserve">—</w:t>
+      </w:r>
+      <w:r>
+        <w:t xml:space="preserve"> </w:t>
+      </w:r>
+      <w:r>
+        <w:rPr>
+          <w:rStyle w:val="VerbatimChar"/>
+        </w:rPr>
+        <w:t xml:space="preserve">man tmux</w:t>
+      </w:r>
+      <w:r>
+        <w:t xml:space="preserve"> </w:t>
+      </w:r>
+      <w:r>
+        <w:t xml:space="preserve">on the host (Mistborn Darwin arm64, tmux 3.6a from</w:t>
+      </w:r>
+      <w:r>
+        <w:t xml:space="preserve"> </w:t>
+      </w:r>
+      <w:r>
+        <w:rPr>
+          <w:rStyle w:val="VerbatimChar"/>
+        </w:rPr>
+        <w:t xml:space="preserve">tmux/build-darwin/bin/tmux</w:t>
+      </w:r>
+      <w:r>
+        <w:t xml:space="preserve">). Confirmed:</w:t>
+      </w:r>
+      <w:r>
+        <w:t xml:space="preserve"> </w:t>
+      </w:r>
+      <w:r>
+        <w:rPr>
+          <w:rStyle w:val="VerbatimChar"/>
+        </w:rPr>
+        <w:t xml:space="preserve">S-</w:t>
+      </w:r>
+      <w:r>
+        <w:t xml:space="preserve"> </w:t>
+      </w:r>
+      <w:r>
+        <w:t xml:space="preserve">/</w:t>
+      </w:r>
+      <w:r>
+        <w:t xml:space="preserve"> </w:t>
+      </w:r>
+      <w:r>
+        <w:rPr>
+          <w:rStyle w:val="VerbatimChar"/>
+        </w:rPr>
+        <w:t xml:space="preserve">M-</w:t>
+      </w:r>
+      <w:r>
+        <w:t xml:space="preserve"> </w:t>
+      </w:r>
+      <w:r>
+        <w:t xml:space="preserve">modifier prefixes for keys including mouse events ("Ctrl keys may be prefixed with</w:t>
+      </w:r>
+      <w:r>
+        <w:t xml:space="preserve"> </w:t>
+      </w:r>
+      <w:r>
+        <w:rPr>
+          <w:rStyle w:val="VerbatimChar"/>
+        </w:rPr>
+        <w:t xml:space="preserve">C-</w:t>
+      </w:r>
+      <w:r>
+        <w:t xml:space="preserve"> </w:t>
+      </w:r>
+      <w:r>
+        <w:t xml:space="preserve">or</w:t>
+      </w:r>
+      <w:r>
+        <w:t xml:space="preserve"> </w:t>
+      </w:r>
+      <w:r>
+        <w:rPr>
+          <w:rStyle w:val="VerbatimChar"/>
+        </w:rPr>
+        <w:t xml:space="preserve">^</w:t>
+      </w:r>
+      <w:r>
+        <w:t xml:space="preserve">, Shift keys with</w:t>
+      </w:r>
+      <w:r>
+        <w:t xml:space="preserve"> </w:t>
+      </w:r>
+      <w:r>
+        <w:rPr>
+          <w:rStyle w:val="VerbatimChar"/>
+        </w:rPr>
+        <w:t xml:space="preserve">S-</w:t>
+      </w:r>
+      <w:r>
+        <w:t xml:space="preserve"> </w:t>
+      </w:r>
+      <w:r>
+        <w:t xml:space="preserve">and Alt (meta) with</w:t>
+      </w:r>
+      <w:r>
+        <w:t xml:space="preserve"> </w:t>
+      </w:r>
+      <w:r>
+        <w:rPr>
+          <w:rStyle w:val="VerbatimChar"/>
+        </w:rPr>
+        <w:t xml:space="preserve">M-</w:t>
+      </w:r>
+      <w:r>
+        <w:t xml:space="preserve">");</w:t>
+      </w:r>
+      <w:r>
+        <w:t xml:space="preserve"> </w:t>
+      </w:r>
+      <w:r>
+        <w:rPr>
+          <w:rStyle w:val="VerbatimChar"/>
+        </w:rPr>
+        <w:t xml:space="preserve">MouseDrag1</w:t>
+      </w:r>
+      <w:r>
+        <w:t xml:space="preserve"> </w:t>
+      </w:r>
+      <w:r>
+        <w:t xml:space="preserve">/</w:t>
+      </w:r>
+      <w:r>
+        <w:t xml:space="preserve"> </w:t>
+      </w:r>
+      <w:r>
+        <w:rPr>
+          <w:rStyle w:val="VerbatimChar"/>
+        </w:rPr>
+        <w:t xml:space="preserve">MouseDragEnd1</w:t>
+      </w:r>
+      <w:r>
+        <w:t xml:space="preserve"> </w:t>
+      </w:r>
+      <w:r>
+        <w:t xml:space="preserve">events listed in MOUSE SUPPORT;</w:t>
+      </w:r>
+      <w:r>
+        <w:t xml:space="preserve"> </w:t>
+      </w:r>
+      <w:r>
+        <w:rPr>
+          <w:rStyle w:val="VerbatimChar"/>
+        </w:rPr>
+        <w:t xml:space="preserve">paste-buffer -p</w:t>
+      </w:r>
+      <w:r>
+        <w:t xml:space="preserve"> </w:t>
+      </w:r>
+      <w:r>
+        <w:t xml:space="preserve">documented as "paste bracket control codes are inserted around the buffer if the application has requested bracketed paste mode"; user options prefixed with</w:t>
+      </w:r>
+      <w:r>
+        <w:t xml:space="preserve"> </w:t>
+      </w:r>
+      <w:r>
+        <w:rPr>
+          <w:rStyle w:val="VerbatimChar"/>
+        </w:rPr>
+        <w:t xml:space="preserve">@</w:t>
+      </w:r>
+      <w:r>
+        <w:t xml:space="preserve"> </w:t>
+      </w:r>
+      <w:r>
+        <w:t xml:space="preserve">are arbitrary and string-typed.</w:t>
+      </w:r>
+    </w:p>
+    <w:p>
+      <w:pPr>
+        <w:pStyle w:val="Compact"/>
+        <w:numPr>
+          <w:ilvl w:val="0"/>
+          <w:numId w:val="1004"/>
+        </w:numPr>
+      </w:pPr>
+      <w:r>
+        <w:rPr>
+          <w:b/>
+          <w:bCs/>
+        </w:rPr>
+        <w:t xml:space="preserve">tmux upstream man page mirror</w:t>
+      </w:r>
+      <w:r>
+        <w:t xml:space="preserve"> </w:t>
+      </w:r>
+      <w:r>
+        <w:t xml:space="preserve">—</w:t>
+      </w:r>
+      <w:r>
+        <w:t xml:space="preserve"> </w:t>
+      </w:r>
+      <w:hyperlink r:id="rId24">
+        <w:r>
+          <w:rPr>
+            <w:rStyle w:val="Hyperlink"/>
+          </w:rPr>
+          <w:t xml:space="preserve">https://man.openbsd.org/tmux.1</w:t>
+        </w:r>
+      </w:hyperlink>
+      <w:r>
+        <w:t xml:space="preserve"> </w:t>
+      </w:r>
+      <w:r>
+        <w:t xml:space="preserve">(verified 2026-05-28; OpenBSD ships the upstream tmux man page).</w:t>
+      </w:r>
+    </w:p>
+    <w:p>
+      <w:pPr>
+        <w:pStyle w:val="Compact"/>
+        <w:numPr>
+          <w:ilvl w:val="0"/>
+          <w:numId w:val="1004"/>
+        </w:numPr>
+      </w:pPr>
+      <w:r>
+        <w:rPr>
+          <w:b/>
+          <w:bCs/>
+        </w:rPr>
         <w:t xml:space="preserve">Anthropic Claude Code documentation</w:t>
       </w:r>
       <w:r>
@@ -3180,7 +3757,7 @@
       <w:r>
         <w:t xml:space="preserve"> </w:t>
       </w:r>
-      <w:hyperlink r:id="rId24">
+      <w:hyperlink r:id="rId26">
         <w:r>
           <w:rPr>
             <w:rStyle w:val="Hyperlink"/>
@@ -3227,7 +3804,7 @@
         <w:pStyle w:val="Compact"/>
         <w:numPr>
           <w:ilvl w:val="0"/>
-          <w:numId w:val="1003"/>
+          <w:numId w:val="1004"/>
         </w:numPr>
       </w:pPr>
       <w:r>
@@ -3259,8 +3836,8 @@
         <w:t xml:space="preserve">(this repo) substitutes for Claude Code in CI to avoid §11.4.98 OAuth/interactive flake while still exercising the exact alt-screen + mouse-tracking surface.</w:t>
       </w:r>
     </w:p>
-    <w:bookmarkEnd w:id="25"/>
-    <w:bookmarkEnd w:id="26"/>
+    <w:bookmarkEnd w:id="27"/>
+    <w:bookmarkEnd w:id="28"/>
     <w:sectPr>
       <w:footnotePr>
         <w:numRestart w:val="eachSect"/>
@@ -3484,6 +4061,9 @@
     <w:abstractNumId w:val="991"/>
   </w:num>
   <w:num w:numId="1003">
+    <w:abstractNumId w:val="991"/>
+  </w:num>
+  <w:num w:numId="1004">
     <w:abstractNumId w:val="991"/>
   </w:num>
 </w:numbering>

</xml_diff>